<commit_message>
New Update from MarsCloud
</commit_message>
<xml_diff>
--- a/Target Folder/QA-Files/zh-CN/1.1.docx
+++ b/Target Folder/QA-Files/zh-CN/1.1.docx
@@ -21,7 +21,7 @@
     <w:p>
       <w:r>
         <w:rPr/>
-        <w:t xml:space="preserve">随着人工智能 (AI) 的兴起，翻译行业正在经历重大变革。从机器翻译系统到先进的神经网络 %&lt;[^&gt;]，人工智能正在塑造语言服务的未来。本文探讨了人工智能在翻译行业中不断演变的角色及其在改变工作流程、质量和人工翻译人员角色方面的潜力。</w:t>
+        <w:t xml:space="preserve">随着人工智能 (AI) 的兴起，翻译行业正在经历重大变革。从机器翻译系统到先进的神经网络 %&lt;[^&gt;]，人工智能正在塑造语言服务的未来。本文档探讨了人工智能在翻译行业中不断演变的作用及其在改变工作流程、质量和人工译员角色方面的潜力。</w:t>
       </w:r>
     </w:p>
     <w:p>
@@ -37,7 +37,7 @@
           <w:b/>
           <w:bCs/>
         </w:rPr>
-        <w:t xml:space="preserve">2. 翻译行业概述</w:t>
+        <w:t xml:space="preserve">2. 翻译行业概览</w:t>
       </w:r>
     </w:p>
     <w:p>
@@ -65,7 +65,7 @@
     <w:p>
       <w:r>
         <w:rPr/>
-        <w:t xml:space="preserve">翻译工具已从早期的 %&lt;[^&gt;] 手动方法演变为复杂的机器翻译系统。早期的系统，如 Google 翻译，依赖于基于规则的模型。然而，统计和神经@test.com 机器翻译的出现使质量和流畅性得到了显著改善。</w:t>
+        <w:t xml:space="preserve">翻译工具已经从早期的 %&lt;[^&gt;] 手动方法演变为复杂的机器翻译系统。早期系统，如 Google 翻译，依赖于基于规则的模型。然而，统计和神经@test.com 机器翻译的出现使质量和流畅性得到了显著改善。</w:t>
       </w:r>
     </w:p>
     <w:p>
@@ -87,7 +87,7 @@
     <w:p>
       <w:r>
         <w:rPr/>
-        <w:t xml:space="preserve">人工智能正在通过自然语言处理 (NLP) 和机器学习等技术重新定义翻译。这些工具帮助理解上下文、语法和句法，从而实现更准确的翻译。人工智能还可以从海量数据中学习，随着时间的推移不断改进 %&lt;[^&gt;]。</w:t>
+        <w:t xml:space="preserve">人工智能正在通过自然语言处理 (NLP) 和机器学习等技术重新定义翻译。这些工具有助于理解上下文、语法和句法，从而实现更准确的翻译。人工智能还可以从大量数据中学习，随着时间的推移不断改进 %&lt;[^&gt;]。</w:t>
       </w:r>
     </w:p>
     <w:p>
@@ -109,7 +109,7 @@
     <w:p>
       <w:r>
         <w:rPr/>
-        <w:t xml:space="preserve">机器翻译 (MT) 是指使用软件将文本从一种语言翻译成另一种语言。基于人工智能的机器翻译系统可以快速处理大量的税务和事实数据，为翻译任务提供经济高效的解决方案。Google 翻译、DeepL 和 Microsoft Translator 是一些领先的例子。</w:t>
+        <w:t xml:space="preserve">机器翻译 (MT) 是指使用软件将文本从一种语言翻译成另一种语言。基于人工智能的机器翻译系统可以快速处理大量的税务和事实数据，为翻译任务提供经济高效的解决方案。Google 翻译、DeepL 和 Microsoft Translator 是一些主要的例子。</w:t>
       </w:r>
     </w:p>
     <w:p/>

</xml_diff>